<commit_message>
Move portal to custom domain mi.dlbinvestigations.co.uk
* CNAME file added at repo root so GitHub Pages serves content for the new
  hostname (DNS CNAME mi → dlbltd.github.io already in place).
* Mailer default PORTAL_URL updated to the new domain.
* AIrep001 + AIarch001 references updated; Word exports regenerated.
* Bundled in: Julie Randle (Transportation Claims Ltd) added to monthly MI
  distribution list.

Driver: insurer corporate firewalls block github.io. The new hostname is on
DLB's own domain and routes through the same GitHub Pages content, so the
firewall sees only dlbinvestigations.co.uk.

Co-Authored-By: Claude Opus 4.7 (1M context) <noreply@anthropic.com>
</commit_message>
<xml_diff>
--- a/docs/exports/AIarch001-MI-Architecture.docx
+++ b/docs/exports/AIarch001-MI-Architecture.docx
@@ -408,13 +408,25 @@
         <w:rPr>
           <w:rStyle w:val="VerbatimChar"/>
         </w:rPr>
-        <w:t xml:space="preserve">https://dlbltd.github.io/MI-Portal/</w:t>
+        <w:t xml:space="preserve">https://mi.dlbinvestigations.co.uk/</w:t>
       </w:r>
       <w:r>
         <w:t xml:space="preserve"> </w:t>
       </w:r>
       <w:r>
-        <w:t xml:space="preserve">GitHub Pages deployment</w:t>
+        <w:t xml:space="preserve">deployment (custom domain CNAME’d to GitHub Pages at</w:t>
+      </w:r>
+      <w:r>
+        <w:t xml:space="preserve"> </w:t>
+      </w:r>
+      <w:r>
+        <w:rPr>
+          <w:rStyle w:val="VerbatimChar"/>
+        </w:rPr>
+        <w:t xml:space="preserve">dlbltd.github.io</w:t>
+      </w:r>
+      <w:r>
+        <w:t xml:space="preserve">)</w:t>
       </w:r>
     </w:p>
     <w:p>

</xml_diff>